<commit_message>
Add separate evidence-backed candidate rows to listing workbooks
</commit_message>
<xml_diff>
--- a/references/manuals/fcc-id-lookup-manual.docx
+++ b/references/manuals/fcc-id-lookup-manual.docx
@@ -12,7 +12,7 @@
     </w:p>
     <w:p>
       <w:r>
-        <w:t>版本日期 2026年10月16日</w:t>
+        <w:t>版本日期 2026年10月21日</w:t>
       </w:r>
     </w:p>
     <w:p>
@@ -330,17 +330,17 @@
     </w:p>
     <w:p>
       <w:r>
-        <w:t>先把证据写入同一份 research-ledger.json，覆盖当前模板的全部字段。用 research_export.py 的 --write-workbook、--mode draft、--stage RESEARCH_REVIEW 生成新文件；候选的 final_value 保持 null，单个推荐或选用 ID 放在 recommended_candidate 中。</w:t>
+        <w:t>先将证据写入同一份 research-ledger.json，再用 research_export.py 生成草稿。所有属性可用 value_candidate 与 value_candidate_source，并记录 candidate_rationale 和 candidate_missing_confirmation；final_value 保持 null。旧 FCC recommended_candidate 可读取，新表统一投影至候选行。无可靠候选或真正并列时两行留空，说明缺项。</w:t>
       </w:r>
     </w:p>
     <w:p>
       <w:r>
-        <w:t>Excel 保留 Product Details、Offer、Safety&amp;Compliance 三张表，以及字段、定义、Value、Status、Source 五行布局。FCC ID 位于 Safety&amp;Compliance 的对应字段，按文本保存；候选说明和证据放入 Source，不将多个 ID 拼进一个单元格。</w:t>
+        <w:t>Excel 保留三张表及原属性列。Source 下新增 Value Candidate 和 Value Candidate Source，统一为七行。候选只写第6行，第7行列来源、推荐理由及缺少的确认；正式 Value 保持空白，状态保持未确认。FCC ID 候选按文本保存，不将多个 ID 拼在一起。</w:t>
       </w:r>
     </w:p>
     <w:p>
       <w:r>
-        <w:t>新增、推荐或明确选用的 ID 标绿；没有所选 ID 的单元格标红。红色项通过状态区分待确认与不适用。历史已确认且 ID 未变时，可保留原颜色。颜色表示研究进度，最终结论以状态和证据为准。</w:t>
+        <w:t>候选两行统一为浅黄色；已确认 FCC ID 的正式 Value 标绿，空白正式值标红。状态仍区分待确认、冲突与不适用。历史已确认且 ID 未变时可保留原颜色；颜色不能替代证据。旧五行表只作原样保留与历史校验，新生成表必须七行。</w:t>
       </w:r>
     </w:p>
     <w:p>
@@ -420,7 +420,7 @@
       <w:rPr>
         <w:sz w:val="18"/>
       </w:rPr>
-      <w:t xml:space="preserve">2026-10-16    第 </w:t>
+      <w:t xml:space="preserve">2026-10-21    第 </w:t>
     </w:r>
     <w:fldSimple w:instr="PAGE"/>
     <w:r>

</xml_diff>